<commit_message>
docs(validación): quitar la información clínica de las entrevistas
La tabla de la muestra describe la dependencia en términos operacionales,
sin diagnósticos ni dispositivos médicos, como pide el protocolo, sección 4.
Mismo criterio en las fichas .docx de docs/entrevistas, en la sección 5 del
documento y en la mención de la arquitectura, sección 16. El análisis y las
conclusiones no cambian.

Co-Authored-By: Claude Opus 5.5 <noreply@anthropic.com>
</commit_message>
<xml_diff>
--- a/docs/entrevistas/Entrevista E01.docx
+++ b/docs/entrevistas/Entrevista E01.docx
@@ -125,13 +125,13 @@
           <w:bCs w:val="1"/>
           <w:rtl w:val="0"/>
         </w:rPr>
-        <w:t>R2:</w:t>
-      </w:r>
-      <w:r>
-        <w:rPr>
-          <w:rtl w:val="0"/>
-        </w:rPr>
-        <w:t xml:space="preserve"> Aproximadamente hace 3 años, desde que su Alzheimer se agravó.</w:t>
+        <w:t xml:space="preserve">R2: Aproximadamente hace 3 años, desde que empezó a necesitar apoyo permanente.</w:t>
+      </w:r>
+      <w:r>
+        <w:rPr>
+          <w:rtl w:val="0"/>
+        </w:rPr>
+        <w:t xml:space="preserve"/>
       </w:r>
     </w:p>
     <w:p>
@@ -723,13 +723,13 @@
           <w:bCs w:val="1"/>
           <w:rtl w:val="0"/>
         </w:rPr>
-        <w:t>R14:</w:t>
-      </w:r>
-      <w:r>
-        <w:rPr>
-          <w:rtl w:val="0"/>
-        </w:rPr>
-        <w:t xml:space="preserve"> Sí cuesta explicar, porqué un paciente con Alzheimer cambia las cosas y no hay una rutina fija. "A veces tienen crisis fuertes, eso cuesta explicar".</w:t>
+        <w:t xml:space="preserve">R14: Sí cuesta explicar, porque ella cambia las cosas y no hay una rutina fija. A veces se altera mucho y eso cuesta explicarlo (paráfrasis).</w:t>
+      </w:r>
+      <w:r>
+        <w:rPr>
+          <w:rtl w:val="0"/>
+        </w:rPr>
+        <w:t xml:space="preserve"/>
       </w:r>
     </w:p>
     <w:p>
@@ -747,14 +747,14 @@
           <w:bCs w:val="1"/>
           <w:rtl w:val="0"/>
         </w:rPr>
-        <w:t>R15:</w:t>
+        <w:t xml:space="preserve">R15: Muchas veces tuvo que cancelar planes o dejar de ir a trabajar porque su mamá se alteraba y era imposible dejarla así en casa (paráfrasis). → El cuidado afecta directamente el presentismo laboral y los planes personales.</w:t>
       </w:r>
       <w:r>
         <w:rPr>
           <w:rFonts w:ascii="Arial Unicode MS" w:cs="Arial Unicode MS" w:eastAsia="Arial Unicode MS" w:hAnsi="Arial Unicode MS"/>
           <w:rtl w:val="0"/>
         </w:rPr>
-        <w:t xml:space="preserve"> "Muchas veces tuve que cancelar planes o dejar de ir a trabajar porque mi mamá tenía alguna crisis y era imposible dejarla así en casa". → </w:t>
+        <w:t xml:space="preserve"/>
       </w:r>
       <w:r>
         <w:rPr>
@@ -762,7 +762,7 @@
           <w:iCs w:val="1"/>
           <w:rtl w:val="0"/>
         </w:rPr>
-        <w:t>El cuidado afecta directamente el presentismo laboral y los planes personales.</w:t>
+        <w:t xml:space="preserve"/>
       </w:r>
     </w:p>
     <w:p>
@@ -1726,13 +1726,13 @@
           <w:bCs w:val="1"/>
           <w:rtl w:val="0"/>
         </w:rPr>
-        <w:t>R35:</w:t>
-      </w:r>
-      <w:r>
-        <w:rPr>
-          <w:rtl w:val="0"/>
-        </w:rPr>
-        <w:t xml:space="preserve"> "Arreglaría poder tener una rutina más predecible sin tantas crisis, para no tener que faltar a mi trabajo o cancelar mis planes."</w:t>
+        <w:t xml:space="preserve">R35: Arreglaría poder tener una rutina más predecible, con menos días en que se altera, para no faltar al trabajo ni cancelar planes (paráfrasis).</w:t>
+      </w:r>
+      <w:r>
+        <w:rPr>
+          <w:rtl w:val="0"/>
+        </w:rPr>
+        <w:t xml:space="preserve"/>
       </w:r>
     </w:p>
     <w:p>
@@ -1812,7 +1812,7 @@
         <w:rPr>
           <w:rtl w:val="0"/>
         </w:rPr>
-        <w:t xml:space="preserve">· Meses en cuidado: ~36 meses (3 años, desde que el Alzheimer se agravó). </w:t>
+        <w:t xml:space="preserve">· Meses en cuidado: ~36 meses (3 años, desde que empezó a necesitar apoyo permanente). </w:t>
       </w:r>
     </w:p>
     <w:p>

</xml_diff>